<commit_message>
feat(i18n): localise all document boilerplate via per-language label dictionary (EN/HI/GU)
Co-Authored-By: Claude Opus 4.8 (1M context) <noreply@anthropic.com>
</commit_message>
<xml_diff>
--- a/templates/lers_preservation_request.docx
+++ b/templates/lers_preservation_request.docx
@@ -12,92 +12,92 @@
           <w:b/>
           <w:sz w:val="28"/>
         </w:rPr>
-        <w:t>DATA PRESERVATION REQUEST / માહિતી જાળવણી વિનંતી</w:t>
+        <w:t>{{ L.lers_pres_heading }}</w:t>
       </w:r>
     </w:p>
     <w:p>
       <w:r>
         <w:rPr>
-          <w:rFonts w:cs="Noto Sans Gujarati"/>
+          <w:rFonts w:ascii="Noto Sans Gujarati" w:hAnsi="Noto Sans Gujarati" w:cs="Noto Sans Gujarati" w:eastAsia="Noto Sans Gujarati"/>
           <w:b/>
         </w:rPr>
-        <w:t>COMPLIANT LAW-ENFORCEMENT REQUEST TEMPLATE — not a live platform API integration.</w:t>
+        <w:t>{{ L.lers_compliant_note }}</w:t>
       </w:r>
     </w:p>
     <w:p/>
     <w:p>
       <w:r>
         <w:rPr>
-          <w:rFonts w:cs="Noto Sans Gujarati"/>
+          <w:rFonts w:ascii="Noto Sans Gujarati" w:hAnsi="Noto Sans Gujarati" w:cs="Noto Sans Gujarati" w:eastAsia="Noto Sans Gujarati"/>
           <w:b w:val="0"/>
         </w:rPr>
-        <w:t>To: The Law Enforcement Response Team,</w:t>
+        <w:t>{{ L.lers_to }}</w:t>
       </w:r>
     </w:p>
     <w:p>
       <w:r>
         <w:rPr>
-          <w:rFonts w:cs="Noto Sans Gujarati"/>
+          <w:rFonts w:ascii="Noto Sans Gujarati" w:hAnsi="Noto Sans Gujarati" w:cs="Noto Sans Gujarati" w:eastAsia="Noto Sans Gujarati"/>
           <w:b w:val="0"/>
         </w:rPr>
-        <w:t>Platform: ____________________  (Meta / WhatsApp / Instagram)</w:t>
+        <w:t>{{ L.lers_platform }} ____________________  (Meta / WhatsApp / Instagram)</w:t>
       </w:r>
     </w:p>
     <w:p/>
     <w:p>
       <w:r>
         <w:rPr>
-          <w:rFonts w:cs="Noto Sans Gujarati"/>
+          <w:rFonts w:ascii="Noto Sans Gujarati" w:hAnsi="Noto Sans Gujarati" w:cs="Noto Sans Gujarati" w:eastAsia="Noto Sans Gujarati"/>
           <w:b w:val="0"/>
         </w:rPr>
-        <w:t>Requesting agency: {{ police_station }}, {{ district }} (India)</w:t>
+        <w:t>{{ L.lers_agency }} {{ police_station }}, {{ district }} (India)</w:t>
       </w:r>
     </w:p>
     <w:p>
       <w:r>
         <w:rPr>
-          <w:rFonts w:cs="Noto Sans Gujarati"/>
+          <w:rFonts w:ascii="Noto Sans Gujarati" w:hAnsi="Noto Sans Gujarati" w:cs="Noto Sans Gujarati" w:eastAsia="Noto Sans Gujarati"/>
           <w:b w:val="0"/>
         </w:rPr>
-        <w:t>Case / FIR No.: {{ case_number }}  (FIR No. {{ fir_number }} dated {{ fir_date }})</w:t>
+        <w:t>{{ L.case_fir_no }}: {{ case_number }}  ({{ L.fir_no }} {{ fir_number }} {{ L.dated }} {{ fir_date }})</w:t>
       </w:r>
     </w:p>
     <w:p>
       <w:r>
         <w:rPr>
-          <w:rFonts w:cs="Noto Sans Gujarati"/>
+          <w:rFonts w:ascii="Noto Sans Gujarati" w:hAnsi="Noto Sans Gujarati" w:cs="Noto Sans Gujarati" w:eastAsia="Noto Sans Gujarati"/>
           <w:b w:val="0"/>
         </w:rPr>
-        <w:t>Investigating Officer: {{ io_name }}, {{ io_rank }}, Badge/Buckle No. {{ io_badge_no }}</w:t>
+        <w:t>{{ L.lers_io }} {{ io_name }}, {{ io_rank }}, {{ L.lers_badge }} {{ io_badge_no }}</w:t>
       </w:r>
     </w:p>
     <w:p/>
     <w:p>
       <w:r>
         <w:rPr>
-          <w:rFonts w:cs="Noto Sans Gujarati"/>
+          <w:rFonts w:ascii="Noto Sans Gujarati" w:hAnsi="Noto Sans Gujarati" w:cs="Noto Sans Gujarati" w:eastAsia="Noto Sans Gujarati"/>
           <w:b w:val="0"/>
         </w:rPr>
-        <w:t>Legal basis: Under Section ________ of the Bharatiya Nagarik Suraksha Sanhita, 2023 (BNSS),</w:t>
+        <w:t>{{ L.lers_legal_basis_a }}</w:t>
       </w:r>
     </w:p>
     <w:p>
       <w:r>
         <w:rPr>
-          <w:rFonts w:cs="Noto Sans Gujarati"/>
+          <w:rFonts w:ascii="Noto Sans Gujarati" w:hAnsi="Noto Sans Gujarati" w:cs="Noto Sans Gujarati" w:eastAsia="Noto Sans Gujarati"/>
           <w:b w:val="0"/>
         </w:rPr>
-        <w:t>in connection with an offence under {{ acts_sections_line }}.</w:t>
+        <w:t>{{ L.lers_legal_basis_b }} {{ acts_sections_line }}.</w:t>
       </w:r>
     </w:p>
     <w:p/>
     <w:p>
       <w:r>
         <w:rPr>
-          <w:rFonts w:cs="Noto Sans Gujarati"/>
+          <w:rFonts w:ascii="Noto Sans Gujarati" w:hAnsi="Noto Sans Gujarati" w:cs="Noto Sans Gujarati" w:eastAsia="Noto Sans Gujarati"/>
           <w:b/>
         </w:rPr>
-        <w:t>Target identifier (account ID / phone number / profile URL):</w:t>
+        <w:t>{{ L.lers_target }}</w:t>
       </w:r>
     </w:p>
     <w:p>
@@ -113,57 +113,57 @@
     <w:p>
       <w:r>
         <w:rPr>
-          <w:rFonts w:cs="Noto Sans Gujarati"/>
+          <w:rFonts w:ascii="Noto Sans Gujarati" w:hAnsi="Noto Sans Gujarati" w:cs="Noto Sans Gujarati" w:eastAsia="Noto Sans Gujarati"/>
           <w:b/>
         </w:rPr>
-        <w:t>Data to be PRESERVED (do not disclose at this stage):</w:t>
+        <w:t>{{ L.lers_pres_data }}</w:t>
       </w:r>
     </w:p>
     <w:p>
       <w:r>
         <w:rPr>
-          <w:rFonts w:cs="Noto Sans Gujarati"/>
+          <w:rFonts w:ascii="Noto Sans Gujarati" w:hAnsi="Noto Sans Gujarati" w:cs="Noto Sans Gujarati" w:eastAsia="Noto Sans Gujarati"/>
           <w:b w:val="0"/>
         </w:rPr>
-        <w:t xml:space="preserve">  [ ] Subscriber / registration information     [ ] Login IP history</w:t>
+        <w:t xml:space="preserve">  [ ] {{ L.lers_opt_subscriber }}     [ ] {{ L.lers_opt_iphist }}</w:t>
       </w:r>
     </w:p>
     <w:p>
       <w:r>
         <w:rPr>
-          <w:rFonts w:cs="Noto Sans Gujarati"/>
+          <w:rFonts w:ascii="Noto Sans Gujarati" w:hAnsi="Noto Sans Gujarati" w:cs="Noto Sans Gujarati" w:eastAsia="Noto Sans Gujarati"/>
           <w:b w:val="0"/>
         </w:rPr>
-        <w:t xml:space="preserve">  [ ] Message / call metadata                   [ ] Media and stored content</w:t>
+        <w:t xml:space="preserve">  [ ] {{ L.lers_opt_metadata }}     [ ] {{ L.lers_opt_content }}</w:t>
       </w:r>
     </w:p>
     <w:p>
       <w:r>
         <w:rPr>
-          <w:rFonts w:cs="Noto Sans Gujarati"/>
+          <w:rFonts w:ascii="Noto Sans Gujarati" w:hAnsi="Noto Sans Gujarati" w:cs="Noto Sans Gujarati" w:eastAsia="Noto Sans Gujarati"/>
           <w:b w:val="0"/>
         </w:rPr>
-        <w:t xml:space="preserve">  Other: ______________________________________________________</w:t>
+        <w:t xml:space="preserve">  {{ L.lers_other }} ______________________________________________________</w:t>
       </w:r>
     </w:p>
     <w:p/>
     <w:p>
       <w:r>
         <w:rPr>
-          <w:rFonts w:cs="Noto Sans Gujarati"/>
+          <w:rFonts w:ascii="Noto Sans Gujarati" w:hAnsi="Noto Sans Gujarati" w:cs="Noto Sans Gujarati" w:eastAsia="Noto Sans Gujarati"/>
           <w:b w:val="0"/>
         </w:rPr>
-        <w:t>Period for which data is to be preserved: from ____________ to ____________</w:t>
+        <w:t>{{ L.lers_pres_period }}</w:t>
       </w:r>
     </w:p>
     <w:p/>
     <w:p>
       <w:r>
         <w:rPr>
-          <w:rFonts w:cs="Noto Sans Gujarati"/>
+          <w:rFonts w:ascii="Noto Sans Gujarati" w:hAnsi="Noto Sans Gujarati" w:cs="Noto Sans Gujarati" w:eastAsia="Noto Sans Gujarati"/>
           <w:b w:val="0"/>
         </w:rPr>
-        <w:t>PRESERVATION STATEMENT: Pursuant to a lawful investigation, you are requested to PRESERVE and NOT delete or alter the data described above associated with the identifier(s) above for a period of ninety (90) days, extendable on further request, pending service of formal legal process for its disclosure. This is a preservation request only — no disclosure of data is sought at this stage.</w:t>
+        <w:t>{{ L.lers_pres_statement }}</w:t>
       </w:r>
     </w:p>
     <w:p/>
@@ -185,11 +185,11 @@
           <w:p>
             <w:r>
               <w:rPr>
-                <w:rFonts w:cs="Noto Sans Gujarati"/>
+                <w:rFonts w:ascii="Noto Sans Gujarati" w:hAnsi="Noto Sans Gujarati" w:cs="Noto Sans Gujarati" w:eastAsia="Noto Sans Gujarati"/>
               </w:rPr>
-              <w:t>Place: {{ police_station }}</w:t>
+              <w:t>{{ L.place }}: {{ police_station }}</w:t>
               <w:br/>
-              <w:t>Date: ____________</w:t>
+              <w:t>{{ L.date }}: ____________</w:t>
             </w:r>
           </w:p>
         </w:tc>
@@ -203,13 +203,13 @@
             </w:pPr>
             <w:r>
               <w:rPr>
-                <w:rFonts w:cs="Noto Sans Gujarati"/>
+                <w:rFonts w:ascii="Noto Sans Gujarati" w:hAnsi="Noto Sans Gujarati" w:cs="Noto Sans Gujarati" w:eastAsia="Noto Sans Gujarati"/>
               </w:rPr>
               <w:t>{{ io_name }}</w:t>
               <w:br/>
-              <w:t>{{ io_rank }} · Badge {{ io_badge_no }}</w:t>
+              <w:t>{{ io_rank }} · {{ L.buckle_no }} {{ io_badge_no }}</w:t>
               <w:br/>
-              <w:t>Investigating Officer</w:t>
+              <w:t>{{ L.io_designation }}</w:t>
             </w:r>
           </w:p>
         </w:tc>
@@ -218,10 +218,10 @@
     <w:p>
       <w:r>
         <w:rPr>
-          <w:rFonts w:cs="Noto Sans Gujarati"/>
+          <w:rFonts w:ascii="Noto Sans Gujarati" w:hAnsi="Noto Sans Gujarati" w:cs="Noto Sans Gujarati" w:eastAsia="Noto Sans Gujarati"/>
           <w:b w:val="0"/>
         </w:rPr>
-        <w:t>NOTE: Compliant request template generated by CrimeGPT — to be verified and signed by the officer. This is not a live platform API integration.</w:t>
+        <w:t>{{ L.lers_note }}</w:t>
       </w:r>
     </w:p>
     <w:sectPr>

</xml_diff>